<commit_message>
Update favicon and finalize remaining portal refinements
</commit_message>
<xml_diff>
--- a/Atualizações Site.docx
+++ b/Atualizações Site.docx
@@ -86,13 +86,7 @@
     <w:p/>
     <w:p>
       <w:r>
-        <w:t>AJUSTES SITE V</w:t>
-      </w:r>
-      <w:r>
-        <w:t>2</w:t>
-      </w:r>
-      <w:r>
-        <w:t>.0</w:t>
+        <w:t>AJUSTES SITE V2.0</w:t>
       </w:r>
     </w:p>
     <w:p>
@@ -193,8 +187,13 @@
       <w:r>
         <w:t xml:space="preserve"> Informática - </w:t>
       </w:r>
-      <w:r>
-        <w:t>All rights reserved)</w:t>
+      <w:proofErr w:type="spellStart"/>
+      <w:r>
+        <w:t>All</w:t>
+      </w:r>
+      <w:proofErr w:type="spellEnd"/>
+      <w:r>
+        <w:t xml:space="preserve"> rights reserved)</w:t>
       </w:r>
     </w:p>
     <w:p>
@@ -256,13 +255,7 @@
     <w:p/>
     <w:p>
       <w:r>
-        <w:t>AJUSTES SITE V</w:t>
-      </w:r>
-      <w:r>
-        <w:t>3</w:t>
-      </w:r>
-      <w:r>
-        <w:t>.0</w:t>
+        <w:t>AJUSTES SITE V3.0</w:t>
       </w:r>
     </w:p>
     <w:p>
@@ -397,6 +390,111 @@
         <w:t xml:space="preserve">O botão do modo escuro pode estar na direita, acima do botão do whats e não lá onde está hoje. </w:t>
       </w:r>
     </w:p>
+    <w:p/>
+    <w:p>
+      <w:r>
+        <w:t>AJUSTES SITE V</w:t>
+      </w:r>
+      <w:r>
+        <w:t>3</w:t>
+      </w:r>
+      <w:r>
+        <w:t>.0</w:t>
+      </w:r>
+    </w:p>
+    <w:p>
+      <w:pPr>
+        <w:pStyle w:val="PargrafodaLista"/>
+        <w:numPr>
+          <w:ilvl w:val="0"/>
+          <w:numId w:val="4"/>
+        </w:numPr>
+      </w:pPr>
+      <w:r>
+        <w:t>Página serviços: Precisamos adicionar mais serviços para complementar essa página;</w:t>
+      </w:r>
+    </w:p>
+    <w:p>
+      <w:pPr>
+        <w:pStyle w:val="PargrafodaLista"/>
+        <w:numPr>
+          <w:ilvl w:val="0"/>
+          <w:numId w:val="4"/>
+        </w:numPr>
+      </w:pPr>
+      <w:r>
+        <w:t>Página quem somos: Tirar o que aconteceu ali no ano de 2024. Cria um 2026, que coloca que é o momento atual, onde atendemos mais de 100 clientes, tem os mais de 2000 usuários... Na parte de nossos diferenciais, favor adicionar ícones acima dos textos. Ali na presença local, abaixo do texto eu gostaria que colocasse um mapinha, mostrando onde a empresa está localizada.</w:t>
+      </w:r>
+    </w:p>
+    <w:p>
+      <w:pPr>
+        <w:pStyle w:val="PargrafodaLista"/>
+        <w:numPr>
+          <w:ilvl w:val="0"/>
+          <w:numId w:val="4"/>
+        </w:numPr>
+      </w:pPr>
+      <w:r>
+        <w:t xml:space="preserve">Página suporte: Tirar o </w:t>
+      </w:r>
+      <w:proofErr w:type="spellStart"/>
+      <w:r>
+        <w:t>limk</w:t>
+      </w:r>
+      <w:proofErr w:type="spellEnd"/>
+      <w:r>
+        <w:t xml:space="preserve"> do </w:t>
+      </w:r>
+      <w:proofErr w:type="spellStart"/>
+      <w:r>
+        <w:t>glpi</w:t>
+      </w:r>
+      <w:proofErr w:type="spellEnd"/>
+      <w:r>
+        <w:t xml:space="preserve">. Tirar esse </w:t>
+      </w:r>
+      <w:proofErr w:type="spellStart"/>
+      <w:r>
+        <w:t>glpi</w:t>
+      </w:r>
+      <w:proofErr w:type="spellEnd"/>
+      <w:r>
+        <w:t xml:space="preserve"> </w:t>
+      </w:r>
+      <w:proofErr w:type="spellStart"/>
+      <w:r>
+        <w:t>desk</w:t>
+      </w:r>
+      <w:proofErr w:type="spellEnd"/>
+      <w:r>
+        <w:t xml:space="preserve"> dali. </w:t>
+      </w:r>
+    </w:p>
+    <w:p>
+      <w:pPr>
+        <w:pStyle w:val="PargrafodaLista"/>
+        <w:numPr>
+          <w:ilvl w:val="0"/>
+          <w:numId w:val="4"/>
+        </w:numPr>
+      </w:pPr>
+      <w:r>
+        <w:t xml:space="preserve">Blog: adicionar mais e mais artigos. Colocar a data dos artigos todos para hoje. </w:t>
+      </w:r>
+    </w:p>
+    <w:p>
+      <w:pPr>
+        <w:pStyle w:val="PargrafodaLista"/>
+        <w:numPr>
+          <w:ilvl w:val="0"/>
+          <w:numId w:val="4"/>
+        </w:numPr>
+      </w:pPr>
+      <w:r>
+        <w:t xml:space="preserve">No hero da homepage, queria achar uma imagem mais interessante. </w:t>
+      </w:r>
+    </w:p>
+    <w:p/>
     <w:sectPr>
       <w:pgSz w:w="11906" w:h="16838"/>
       <w:pgMar w:top="1417" w:right="1701" w:bottom="1417" w:left="1701" w:header="708" w:footer="708" w:gutter="0"/>
@@ -549,6 +647,95 @@
     </w:lvl>
   </w:abstractNum>
   <w:abstractNum w:abstractNumId="1" w15:restartNumberingAfterBreak="0">
+    <w:nsid w:val="0FB42EFE"/>
+    <w:multiLevelType w:val="hybridMultilevel"/>
+    <w:tmpl w:val="5860B098"/>
+    <w:lvl w:ilvl="0" w:tplc="0416000F">
+      <w:start w:val="1"/>
+      <w:numFmt w:val="decimal"/>
+      <w:lvlText w:val="%1."/>
+      <w:lvlJc w:val="left"/>
+      <w:pPr>
+        <w:ind w:left="720" w:hanging="360"/>
+      </w:pPr>
+      <w:rPr>
+        <w:rFonts w:hint="default"/>
+      </w:rPr>
+    </w:lvl>
+    <w:lvl w:ilvl="1" w:tplc="04160019" w:tentative="1">
+      <w:start w:val="1"/>
+      <w:numFmt w:val="lowerLetter"/>
+      <w:lvlText w:val="%2."/>
+      <w:lvlJc w:val="left"/>
+      <w:pPr>
+        <w:ind w:left="1440" w:hanging="360"/>
+      </w:pPr>
+    </w:lvl>
+    <w:lvl w:ilvl="2" w:tplc="0416001B" w:tentative="1">
+      <w:start w:val="1"/>
+      <w:numFmt w:val="lowerRoman"/>
+      <w:lvlText w:val="%3."/>
+      <w:lvlJc w:val="right"/>
+      <w:pPr>
+        <w:ind w:left="2160" w:hanging="180"/>
+      </w:pPr>
+    </w:lvl>
+    <w:lvl w:ilvl="3" w:tplc="0416000F" w:tentative="1">
+      <w:start w:val="1"/>
+      <w:numFmt w:val="decimal"/>
+      <w:lvlText w:val="%4."/>
+      <w:lvlJc w:val="left"/>
+      <w:pPr>
+        <w:ind w:left="2880" w:hanging="360"/>
+      </w:pPr>
+    </w:lvl>
+    <w:lvl w:ilvl="4" w:tplc="04160019" w:tentative="1">
+      <w:start w:val="1"/>
+      <w:numFmt w:val="lowerLetter"/>
+      <w:lvlText w:val="%5."/>
+      <w:lvlJc w:val="left"/>
+      <w:pPr>
+        <w:ind w:left="3600" w:hanging="360"/>
+      </w:pPr>
+    </w:lvl>
+    <w:lvl w:ilvl="5" w:tplc="0416001B" w:tentative="1">
+      <w:start w:val="1"/>
+      <w:numFmt w:val="lowerRoman"/>
+      <w:lvlText w:val="%6."/>
+      <w:lvlJc w:val="right"/>
+      <w:pPr>
+        <w:ind w:left="4320" w:hanging="180"/>
+      </w:pPr>
+    </w:lvl>
+    <w:lvl w:ilvl="6" w:tplc="0416000F" w:tentative="1">
+      <w:start w:val="1"/>
+      <w:numFmt w:val="decimal"/>
+      <w:lvlText w:val="%7."/>
+      <w:lvlJc w:val="left"/>
+      <w:pPr>
+        <w:ind w:left="5040" w:hanging="360"/>
+      </w:pPr>
+    </w:lvl>
+    <w:lvl w:ilvl="7" w:tplc="04160019" w:tentative="1">
+      <w:start w:val="1"/>
+      <w:numFmt w:val="lowerLetter"/>
+      <w:lvlText w:val="%8."/>
+      <w:lvlJc w:val="left"/>
+      <w:pPr>
+        <w:ind w:left="5760" w:hanging="360"/>
+      </w:pPr>
+    </w:lvl>
+    <w:lvl w:ilvl="8" w:tplc="0416001B" w:tentative="1">
+      <w:start w:val="1"/>
+      <w:numFmt w:val="lowerRoman"/>
+      <w:lvlText w:val="%9."/>
+      <w:lvlJc w:val="right"/>
+      <w:pPr>
+        <w:ind w:left="6480" w:hanging="180"/>
+      </w:pPr>
+    </w:lvl>
+  </w:abstractNum>
+  <w:abstractNum w:abstractNumId="2" w15:restartNumberingAfterBreak="0">
     <w:nsid w:val="4E5A09E1"/>
     <w:multiLevelType w:val="hybridMultilevel"/>
     <w:tmpl w:val="D688BFAE"/>
@@ -637,7 +824,7 @@
       </w:pPr>
     </w:lvl>
   </w:abstractNum>
-  <w:abstractNum w:abstractNumId="2" w15:restartNumberingAfterBreak="0">
+  <w:abstractNum w:abstractNumId="3" w15:restartNumberingAfterBreak="0">
     <w:nsid w:val="564D12A3"/>
     <w:multiLevelType w:val="hybridMultilevel"/>
     <w:tmpl w:val="AF109674"/>
@@ -727,13 +914,16 @@
     </w:lvl>
   </w:abstractNum>
   <w:num w:numId="1" w16cid:durableId="1460421215">
-    <w:abstractNumId w:val="1"/>
+    <w:abstractNumId w:val="2"/>
   </w:num>
   <w:num w:numId="2" w16cid:durableId="1417288727">
-    <w:abstractNumId w:val="2"/>
+    <w:abstractNumId w:val="3"/>
   </w:num>
   <w:num w:numId="3" w16cid:durableId="882060569">
     <w:abstractNumId w:val="0"/>
+  </w:num>
+  <w:num w:numId="4" w16cid:durableId="65804780">
+    <w:abstractNumId w:val="1"/>
   </w:num>
 </w:numbering>
 </file>
@@ -1341,6 +1531,7 @@
   <w:style w:type="character" w:default="1" w:styleId="Fontepargpadro">
     <w:name w:val="Default Paragraph Font"/>
     <w:uiPriority w:val="1"/>
+    <w:semiHidden/>
     <w:unhideWhenUsed/>
   </w:style>
   <w:style w:type="table" w:default="1" w:styleId="Tabelanormal">

</xml_diff>